<commit_message>
Add roadie and music-promo background to Splice application
Josh confirmed two real, if informal and pre-professional, music-
industry connections from college: roadie work for Head for the Hills
(Fort Collins bluegrass band) and promo work with Mammoth Music Group.
Captured band/group names in master-profile.md's Early/Pre-Professional
Background section.

Rewrote the Splice cover letter's opening to use both as the authentic
personal hook instead of just naming "no music-industry experience"
outright, per the profile's own guidance that this context is meant for
exactly this kind of employer. Domain-alignment score moved 8 -> 9
(total 62 -> 63) to reflect the genuine, if modest, additional evidence.

Co-Authored-By: Claude Sonnet 5 <noreply@anthropic.com>
Claude-Session: https://claude.ai/code/session_01HeZspKnLVkWbr9yhNEisQZ
</commit_message>
<xml_diff>
--- a/applications/splice-sounds-business-operations-manager/Rotenberg Cover Letter - Splice - Sounds Business Operations Manager.docx
+++ b/applications/splice-sounds-business-operations-manager/Rotenberg Cover Letter - Splice - Sounds Business Operations Manager.docx
@@ -94,7 +94,7 @@
           <w:b w:val="0"/>
           <w:color w:val="1A1A1A"/>
         </w:rPr>
-        <w:t>I want to name two things upfront: I've never held the title Program Manager or Business Operations Manager, and I don't have music-industry experience. What I do have is 15+ years running inside subscription SaaS businesses, building the exact kind of operational infrastructure this role owns, and I think that's worth a conversation.</w:t>
+        <w:t>I want to name two things upfront: I've never held the title Program Manager or Business Operations Manager, and my professional background isn't in music. My personal connection to it goes back further, though. In college I roadied for Head for the Hills, a Fort Collins bluegrass band, and did promo work with the team at Mammoth Music Group, and live music has stayed a real interest ever since. What I bring professionally is 15+ years running inside subscription SaaS businesses, building the exact kind of operational infrastructure this role owns, and I think that combination is worth a conversation.</w:t>
       </w:r>
     </w:p>
     <w:p>
@@ -120,7 +120,7 @@
           <w:b w:val="0"/>
           <w:color w:val="1A1A1A"/>
         </w:rPr>
-        <w:t>I'd welcome the chance to talk about how that operational background, inside subscription businesses even without the music vertical, could work for the Sounds team.</w:t>
+        <w:t>I'd welcome the chance to talk about how that operational background, built inside subscription businesses and grounded in a real personal connection to music, could work for the Sounds team.</w:t>
       </w:r>
     </w:p>
     <w:p>

</xml_diff>